<commit_message>
fix: include product_images in product queries and map to images field
- findProducts now joins product_images table (was select('*'))
- Controller maps product_images -> images in GET /products and GET /products/:id
- Updated seed.mjs to delete existing seed products before re-creating
- All 15 product images upload to Cloudinary successfully
</commit_message>
<xml_diff>
--- a/Gestión/1.1.2 Documento de registro de definición e identificación del proyecto.docx
+++ b/Gestión/1.1.2 Documento de registro de definición e identificación del proyecto.docx
@@ -1002,7 +1002,7 @@
               </wp:anchor>
             </w:drawing>
           </mc:Choice>
-          <mc:Fallback xmlns:a="http://schemas.openxmlformats.org/drawingml/2006/main" xmlns:pic="http://schemas.openxmlformats.org/drawingml/2006/picture" xmlns:asvg="http://schemas.microsoft.com/office/drawing/2016/SVG/main">
+          <mc:Fallback xmlns:asvg="http://schemas.microsoft.com/office/drawing/2016/SVG/main" xmlns:pic="http://schemas.openxmlformats.org/drawingml/2006/picture" xmlns:a="http://schemas.openxmlformats.org/drawingml/2006/main">
             <w:pict>
               <v:line id="Conector recto 12" style="position:absolute;flip:y;z-index:251671555;visibility:visible;mso-wrap-style:square;mso-width-percent:0;mso-height-percent:0;mso-wrap-distance-left:9pt;mso-wrap-distance-top:-3e-5mm;mso-wrap-distance-right:9pt;mso-wrap-distance-bottom:-3e-5mm;mso-position-horizontal:absolute;mso-position-horizontal-relative:text;mso-position-vertical:absolute;mso-position-vertical-relative:text;mso-width-percent:0;mso-height-percent:0;mso-width-relative:margin;mso-height-relative:margin" o:spid="_x0000_s1026" strokecolor="#b4c6e7 [1300]" strokeweight=".5pt" from="1.2pt,6.25pt" to="440.55pt,6.25pt" w14:anchorId="0C8B07C6" o:gfxdata="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">
                 <v:stroke joinstyle="miter"/>
@@ -1323,7 +1323,7 @@
               </wp:anchor>
             </w:drawing>
           </mc:Choice>
-          <mc:Fallback xmlns:a="http://schemas.openxmlformats.org/drawingml/2006/main" xmlns:pic="http://schemas.openxmlformats.org/drawingml/2006/picture" xmlns:asvg="http://schemas.microsoft.com/office/drawing/2016/SVG/main">
+          <mc:Fallback xmlns:asvg="http://schemas.microsoft.com/office/drawing/2016/SVG/main" xmlns:pic="http://schemas.openxmlformats.org/drawingml/2006/picture" xmlns:a="http://schemas.openxmlformats.org/drawingml/2006/main">
             <w:pict>
               <v:line id="Conector recto 11" style="position:absolute;z-index:251673603;visibility:visible;mso-wrap-style:square;mso-width-percent:0;mso-height-percent:0;mso-wrap-distance-left:9pt;mso-wrap-distance-top:-3e-5mm;mso-wrap-distance-right:9pt;mso-wrap-distance-bottom:-3e-5mm;mso-position-horizontal:absolute;mso-position-horizontal-relative:text;mso-position-vertical:absolute;mso-position-vertical-relative:text;mso-width-percent:0;mso-height-percent:0;mso-width-relative:page;mso-height-relative:page" o:spid="_x0000_s1026" strokecolor="#b4c6e7 [1300]" strokeweight=".5pt" from="0,-.05pt" to="440.15pt,-.05pt" w14:anchorId="4878FEF2" o:gfxdata="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">
                 <v:stroke joinstyle="miter"/>
@@ -1697,7 +1697,7 @@
               </wp:anchor>
             </w:drawing>
           </mc:Choice>
-          <mc:Fallback xmlns:a="http://schemas.openxmlformats.org/drawingml/2006/main" xmlns:pic="http://schemas.openxmlformats.org/drawingml/2006/picture" xmlns:asvg="http://schemas.microsoft.com/office/drawing/2016/SVG/main">
+          <mc:Fallback xmlns:asvg="http://schemas.microsoft.com/office/drawing/2016/SVG/main" xmlns:pic="http://schemas.openxmlformats.org/drawingml/2006/picture" xmlns:a="http://schemas.openxmlformats.org/drawingml/2006/main">
             <w:pict>
               <v:line id="Conector recto 10" style="position:absolute;z-index:251675651;visibility:visible;mso-wrap-style:square;mso-width-percent:0;mso-height-percent:0;mso-wrap-distance-left:9pt;mso-wrap-distance-top:-3e-5mm;mso-wrap-distance-right:9pt;mso-wrap-distance-bottom:-3e-5mm;mso-position-horizontal:absolute;mso-position-horizontal-relative:text;mso-position-vertical:absolute;mso-position-vertical-relative:text;mso-width-percent:0;mso-height-percent:0;mso-width-relative:margin;mso-height-relative:margin" o:spid="_x0000_s1026" strokecolor="#b4c6e7 [1300]" strokeweight=".5pt" from="-.05pt,3.4pt" to="440.1pt,3.4pt" w14:anchorId="4A06B2A9" o:gfxdata="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">
                 <v:stroke joinstyle="miter"/>
@@ -2472,7 +2472,7 @@
           </w:tcPr>
           <w:p>
             <w:r>
-              <w:t>20.123.456-7</w:t>
+              <w:t>18.499.797-5</w:t>
             </w:r>
           </w:p>
         </w:tc>
@@ -2490,11 +2490,7 @@
               <w:right w:w="105" w:type="dxa"/>
             </w:tcMar>
           </w:tcPr>
-          <w:p>
-            <w:r>
-              <w:t>21.234.567-8</w:t>
-            </w:r>
-          </w:p>
+          <w:p/>
         </w:tc>
         <w:tc>
           <w:tcPr>
@@ -2510,11 +2506,7 @@
               <w:right w:w="105" w:type="dxa"/>
             </w:tcMar>
           </w:tcPr>
-          <w:p>
-            <w:r>
-              <w:t>22.345.678-9</w:t>
-            </w:r>
-          </w:p>
+          <w:p/>
         </w:tc>
       </w:tr>
       <w:tr>
@@ -2594,7 +2586,7 @@
           </w:tcPr>
           <w:p>
             <w:r>
-              <w:t>Deyanira Aracely</w:t>
+              <w:t>Deyanira</w:t>
             </w:r>
           </w:p>
         </w:tc>
@@ -2614,7 +2606,7 @@
           </w:tcPr>
           <w:p>
             <w:r>
-              <w:t>Priscila Estefanía</w:t>
+              <w:t xml:space="preserve">Priscila </w:t>
             </w:r>
           </w:p>
         </w:tc>
@@ -2696,7 +2688,7 @@
           </w:tcPr>
           <w:p>
             <w:r>
-              <w:t>Leyton Fredes</w:t>
+              <w:t xml:space="preserve">Leyton </w:t>
             </w:r>
           </w:p>
         </w:tc>
@@ -2716,7 +2708,7 @@
           </w:tcPr>
           <w:p>
             <w:r>
-              <w:t>Calderón Marín</w:t>
+              <w:t>Calderón</w:t>
             </w:r>
           </w:p>
         </w:tc>
@@ -3392,7 +3384,55 @@
           </w:tcPr>
           <w:p>
             <w:r>
-              <w:t>MVP funcional con API REST backend (Node.js/Express/Supabase), frontend React, deploy cloud (Vercel/Render). Incluye: catálogo, arriendos, devoluciones, ventas, despacho, CRUD administrativos. Excluye: pagos en línea, facturación electrónica.</w:t>
+              <w:rPr>
+                <w:lang w:val="en-US"/>
+              </w:rPr>
+              <w:t xml:space="preserve">MVP </w:t>
+            </w:r>
+            <w:proofErr w:type="spellStart"/>
+            <w:r>
+              <w:rPr>
+                <w:lang w:val="en-US"/>
+              </w:rPr>
+              <w:t>funcional</w:t>
+            </w:r>
+            <w:proofErr w:type="spellEnd"/>
+            <w:r>
+              <w:rPr>
+                <w:lang w:val="en-US"/>
+              </w:rPr>
+              <w:t xml:space="preserve"> con API REST backend (Node.js/Express/</w:t>
+            </w:r>
+            <w:proofErr w:type="spellStart"/>
+            <w:r>
+              <w:rPr>
+                <w:lang w:val="en-US"/>
+              </w:rPr>
+              <w:t>Supabase</w:t>
+            </w:r>
+            <w:proofErr w:type="spellEnd"/>
+            <w:r>
+              <w:rPr>
+                <w:lang w:val="en-US"/>
+              </w:rPr>
+              <w:t>), frontend React, deploy cloud (</w:t>
+            </w:r>
+            <w:proofErr w:type="spellStart"/>
+            <w:r>
+              <w:rPr>
+                <w:lang w:val="en-US"/>
+              </w:rPr>
+              <w:t>Vercel</w:t>
+            </w:r>
+            <w:proofErr w:type="spellEnd"/>
+            <w:r>
+              <w:rPr>
+                <w:lang w:val="en-US"/>
+              </w:rPr>
+              <w:t xml:space="preserve">/Render). </w:t>
+            </w:r>
+            <w:r>
+              <w:t>Incluye: catálogo, arriendos, devoluciones, ventas, despacho, CRUD administrativos. Excluye: pagos en línea, facturación electrónica.</w:t>
             </w:r>
           </w:p>
         </w:tc>
@@ -3438,6 +3478,109 @@
         </w:rPr>
       </w:pPr>
     </w:p>
+    <w:p>
+      <w:pPr>
+        <w:spacing w:after="160" w:line="259" w:lineRule="auto"/>
+        <w:rPr>
+          <w:rFonts w:ascii="Calibri" w:eastAsia="Calibri" w:hAnsi="Calibri" w:cs="Calibri"/>
+          <w:color w:val="000000" w:themeColor="text1"/>
+          <w:lang w:val="es-ES"/>
+        </w:rPr>
+      </w:pPr>
+    </w:p>
+    <w:tbl>
+      <w:tblPr>
+        <w:tblStyle w:val="TableGrid"/>
+        <w:tblW w:w="8835" w:type="dxa"/>
+        <w:tblBorders>
+          <w:top w:val="single" w:sz="6" w:space="0" w:color="auto"/>
+          <w:left w:val="single" w:sz="6" w:space="0" w:color="auto"/>
+          <w:bottom w:val="single" w:sz="6" w:space="0" w:color="auto"/>
+          <w:right w:val="single" w:sz="6" w:space="0" w:color="auto"/>
+        </w:tblBorders>
+        <w:tblLayout w:type="fixed"/>
+        <w:tblLook w:val="04A0" w:firstRow="1" w:lastRow="0" w:firstColumn="1" w:lastColumn="0" w:noHBand="0" w:noVBand="1"/>
+      </w:tblPr>
+      <w:tblGrid>
+        <w:gridCol w:w="8835"/>
+      </w:tblGrid>
+      <w:tr>
+        <w:trPr>
+          <w:trHeight w:val="435"/>
+        </w:trPr>
+        <w:tc>
+          <w:tcPr>
+            <w:tcW w:w="8835" w:type="dxa"/>
+            <w:tcBorders>
+              <w:top w:val="single" w:sz="6" w:space="0" w:color="BFBFBF" w:themeColor="background1" w:themeShade="BF"/>
+              <w:left w:val="single" w:sz="6" w:space="0" w:color="BFBFBF" w:themeColor="background1" w:themeShade="BF"/>
+              <w:bottom w:val="single" w:sz="6" w:space="0" w:color="BFBFBF" w:themeColor="background1" w:themeShade="BF"/>
+              <w:right w:val="single" w:sz="6" w:space="0" w:color="BFBFBF" w:themeColor="background1" w:themeShade="BF"/>
+            </w:tcBorders>
+            <w:tcMar>
+              <w:left w:w="105" w:type="dxa"/>
+              <w:right w:w="105" w:type="dxa"/>
+            </w:tcMar>
+            <w:vAlign w:val="center"/>
+          </w:tcPr>
+          <w:p>
+            <w:pPr>
+              <w:spacing w:line="259" w:lineRule="auto"/>
+              <w:rPr>
+                <w:rFonts w:ascii="Calibri" w:eastAsia="Calibri" w:hAnsi="Calibri" w:cs="Calibri"/>
+                <w:color w:val="1F4E79" w:themeColor="accent5" w:themeShade="80"/>
+                <w:sz w:val="28"/>
+                <w:szCs w:val="28"/>
+              </w:rPr>
+            </w:pPr>
+            <w:r>
+              <w:rPr>
+                <w:rFonts w:ascii="Calibri" w:eastAsia="Calibri" w:hAnsi="Calibri" w:cs="Calibri"/>
+                <w:b/>
+                <w:bCs/>
+                <w:color w:val="1F4E79" w:themeColor="accent5" w:themeShade="80"/>
+                <w:sz w:val="28"/>
+                <w:szCs w:val="28"/>
+              </w:rPr>
+              <w:lastRenderedPageBreak/>
+              <w:t>3. Contexto del proyecto</w:t>
+            </w:r>
+          </w:p>
+        </w:tc>
+      </w:tr>
+      <w:tr>
+        <w:trPr>
+          <w:trHeight w:val="435"/>
+        </w:trPr>
+        <w:tc>
+          <w:tcPr>
+            <w:tcW w:w="8835" w:type="dxa"/>
+            <w:tcBorders>
+              <w:top w:val="single" w:sz="6" w:space="0" w:color="BFBFBF" w:themeColor="background1" w:themeShade="BF"/>
+              <w:left w:val="single" w:sz="6" w:space="0" w:color="BFBFBF" w:themeColor="background1" w:themeShade="BF"/>
+              <w:bottom w:val="single" w:sz="6" w:space="0" w:color="BFBFBF" w:themeColor="background1" w:themeShade="BF"/>
+              <w:right w:val="single" w:sz="6" w:space="0" w:color="BFBFBF" w:themeColor="background1" w:themeShade="BF"/>
+            </w:tcBorders>
+            <w:tcMar>
+              <w:left w:w="105" w:type="dxa"/>
+              <w:right w:w="105" w:type="dxa"/>
+            </w:tcMar>
+            <w:vAlign w:val="center"/>
+          </w:tcPr>
+          <w:p>
+            <w:r>
+              <w:t>La PYME chilena dedicada al arriendo de vestuario (trajes de baile, folclore y disfraces) y venta de calzado asociado opera actualmente con procesos manuales: WhatsApp y llamadas para reservas, planillas Excel para stock, catálogo disperso en redes sociales. El público objetivo son personas naturales, empresas y agrupaciones culturales que requieren vestimenta para eventos y presentaciones.</w:t>
+            </w:r>
+          </w:p>
+          <w:p/>
+          <w:p>
+            <w:r>
+              <w:t>La motivación principal es digitalizar y optimizar la gestión del negocio, transformando procesos manuales en un sistema integrado, automatizado y basado en datos. La oportunidad de mejora identificada es que el negocio está perdiendo clientes potenciales al no tener un catálogo digital accesible 24/7 ni un sistema de reservas automatizado, lo que afecta su competitividad.</w:t>
+            </w:r>
+          </w:p>
+        </w:tc>
+      </w:tr>
+    </w:tbl>
     <w:p>
       <w:pPr>
         <w:spacing w:after="160" w:line="259" w:lineRule="auto"/>
@@ -3502,8 +3645,7 @@
                 <w:sz w:val="28"/>
                 <w:szCs w:val="28"/>
               </w:rPr>
-              <w:lastRenderedPageBreak/>
-              <w:t>3. Contexto del proyecto</w:t>
+              <w:t>4. Metodología</w:t>
             </w:r>
           </w:p>
         </w:tc>
@@ -3521,6 +3663,7 @@
               <w:bottom w:val="single" w:sz="6" w:space="0" w:color="BFBFBF" w:themeColor="background1" w:themeShade="BF"/>
               <w:right w:val="single" w:sz="6" w:space="0" w:color="BFBFBF" w:themeColor="background1" w:themeShade="BF"/>
             </w:tcBorders>
+            <w:shd w:val="clear" w:color="auto" w:fill="DEEAF6" w:themeFill="accent5" w:themeFillTint="33"/>
             <w:tcMar>
               <w:left w:w="105" w:type="dxa"/>
               <w:right w:w="105" w:type="dxa"/>
@@ -3528,15 +3671,100 @@
             <w:vAlign w:val="center"/>
           </w:tcPr>
           <w:p>
-            <w:r>
-              <w:t>La PYME chilena dedicada al arriendo de vestuario (trajes de baile, folclore y disfraces) y venta de calzado asociado opera actualmente con procesos manuales: WhatsApp y llamadas para reservas, planillas Excel para stock, catálogo disperso en redes sociales. El público objetivo son personas naturales, empresas y agrupaciones culturales que requieren vestimenta para eventos y presentaciones.</w:t>
+            <w:pPr>
+              <w:pStyle w:val="Footer"/>
+              <w:jc w:val="both"/>
+              <w:rPr>
+                <w:rFonts w:ascii="Calibri" w:eastAsia="Calibri" w:hAnsi="Calibri" w:cs="Calibri"/>
+                <w:color w:val="1F4E79" w:themeColor="accent5" w:themeShade="80"/>
+                <w:sz w:val="22"/>
+                <w:szCs w:val="22"/>
+              </w:rPr>
+            </w:pPr>
+            <w:r>
+              <w:rPr>
+                <w:rFonts w:ascii="Calibri" w:eastAsia="Calibri" w:hAnsi="Calibri" w:cs="Calibri"/>
+                <w:color w:val="1F4E79" w:themeColor="accent5" w:themeShade="80"/>
+                <w:sz w:val="22"/>
+                <w:szCs w:val="22"/>
+              </w:rPr>
+              <w:t>Describir la metodología a utilizar para el desarrollo del proyecto y justificar su uso.</w:t>
+            </w:r>
+          </w:p>
+        </w:tc>
+      </w:tr>
+    </w:tbl>
+    <w:p>
+      <w:pPr>
+        <w:spacing w:line="360" w:lineRule="auto"/>
+        <w:jc w:val="both"/>
+        <w:rPr>
+          <w:rFonts w:ascii="Calibri" w:eastAsia="Calibri" w:hAnsi="Calibri" w:cs="Calibri"/>
+          <w:color w:val="000000" w:themeColor="text1"/>
+          <w:lang w:val="es-ES"/>
+        </w:rPr>
+      </w:pPr>
+    </w:p>
+    <w:tbl>
+      <w:tblPr>
+        <w:tblStyle w:val="TableGrid"/>
+        <w:tblW w:w="0" w:type="auto"/>
+        <w:tblBorders>
+          <w:top w:val="single" w:sz="6" w:space="0" w:color="auto"/>
+          <w:left w:val="single" w:sz="6" w:space="0" w:color="auto"/>
+          <w:bottom w:val="single" w:sz="6" w:space="0" w:color="auto"/>
+          <w:right w:val="single" w:sz="6" w:space="0" w:color="auto"/>
+        </w:tblBorders>
+        <w:tblLayout w:type="fixed"/>
+        <w:tblLook w:val="04A0" w:firstRow="1" w:lastRow="0" w:firstColumn="1" w:lastColumn="0" w:noHBand="0" w:noVBand="1"/>
+      </w:tblPr>
+      <w:tblGrid>
+        <w:gridCol w:w="8835"/>
+      </w:tblGrid>
+      <w:tr>
+        <w:trPr>
+          <w:trHeight w:val="300"/>
+        </w:trPr>
+        <w:tc>
+          <w:tcPr>
+            <w:tcW w:w="8835" w:type="dxa"/>
+            <w:tcBorders>
+              <w:top w:val="single" w:sz="6" w:space="0" w:color="BFBFBF" w:themeColor="background1" w:themeShade="BF"/>
+              <w:left w:val="single" w:sz="6" w:space="0" w:color="BFBFBF" w:themeColor="background1" w:themeShade="BF"/>
+              <w:bottom w:val="single" w:sz="6" w:space="0" w:color="BFBFBF" w:themeColor="background1" w:themeShade="BF"/>
+              <w:right w:val="single" w:sz="6" w:space="0" w:color="BFBFBF" w:themeColor="background1" w:themeShade="BF"/>
+            </w:tcBorders>
+            <w:tcMar>
+              <w:left w:w="105" w:type="dxa"/>
+              <w:right w:w="105" w:type="dxa"/>
+            </w:tcMar>
+          </w:tcPr>
+          <w:p>
+            <w:pPr>
+              <w:spacing w:line="259" w:lineRule="auto"/>
+              <w:jc w:val="center"/>
+              <w:rPr>
+                <w:rFonts w:ascii="Calibri" w:eastAsia="Calibri" w:hAnsi="Calibri" w:cs="Calibri"/>
+                <w:color w:val="1F4E79" w:themeColor="accent5" w:themeShade="80"/>
+                <w:sz w:val="22"/>
+                <w:szCs w:val="22"/>
+              </w:rPr>
+            </w:pPr>
+            <w:r>
+              <w:rPr>
+                <w:rFonts w:ascii="Calibri" w:eastAsia="Calibri" w:hAnsi="Calibri" w:cs="Calibri"/>
+                <w:color w:val="1F4E79" w:themeColor="accent5" w:themeShade="80"/>
+                <w:sz w:val="22"/>
+                <w:szCs w:val="22"/>
+              </w:rPr>
+              <w:t>Descripción Metodología</w:t>
             </w:r>
           </w:p>
         </w:tc>
       </w:tr>
       <w:tr>
         <w:trPr>
-          <w:trHeight w:val="435"/>
+          <w:trHeight w:val="1920"/>
         </w:trPr>
         <w:tc>
           <w:tcPr>
@@ -3551,11 +3779,10 @@
               <w:left w:w="105" w:type="dxa"/>
               <w:right w:w="105" w:type="dxa"/>
             </w:tcMar>
-            <w:vAlign w:val="center"/>
-          </w:tcPr>
-          <w:p>
-            <w:r>
-              <w:t>La motivación principal es digitalizar y optimizar la gestión del negocio, transformando procesos manuales en un sistema integrado, automatizado y basado en datos. La oportunidad de mejora identificada es que el negocio está perdiendo clientes potenciales al no tener un catálogo digital accesible 24/7 ni un sistema de reservas automatizado, lo que afecta su competitividad.</w:t>
+          </w:tcPr>
+          <w:p>
+            <w:r>
+              <w:t>Metodología ágil Scrum adaptada al contexto académico, con sprints semanales alineados a los hitos de entrega. Ciclo de vida iterativo-incremental. Roles: Product Owner (docente), Scrum Master (coordinador del equipo), Development Team (3 integrantes). Ceremonias: reunión de planificación al inicio de cada sprint, revisión semanal de avances. Herramientas: GitHub Projects (Kanban), Pull Requests con revisión cruzada.</w:t>
             </w:r>
           </w:p>
         </w:tc>
@@ -3563,7 +3790,8 @@
     </w:tbl>
     <w:p>
       <w:pPr>
-        <w:spacing w:after="160" w:line="259" w:lineRule="auto"/>
+        <w:spacing w:after="160" w:line="360" w:lineRule="auto"/>
+        <w:jc w:val="both"/>
         <w:rPr>
           <w:rFonts w:ascii="Calibri" w:eastAsia="Calibri" w:hAnsi="Calibri" w:cs="Calibri"/>
           <w:color w:val="000000" w:themeColor="text1"/>
@@ -3625,7 +3853,7 @@
                 <w:sz w:val="28"/>
                 <w:szCs w:val="28"/>
               </w:rPr>
-              <w:t>4. Metodología</w:t>
+              <w:t>5. Descripción técnica de la solución</w:t>
             </w:r>
           </w:p>
         </w:tc>
@@ -3668,7 +3896,7 @@
                 <w:sz w:val="22"/>
                 <w:szCs w:val="22"/>
               </w:rPr>
-              <w:t>Describir la metodología a utilizar para el desarrollo del proyecto y justificar su uso.</w:t>
+              <w:t>Describir los detalles técnicos del producto a desarrollar</w:t>
             </w:r>
           </w:p>
         </w:tc>
@@ -3726,18 +3954,20 @@
               <w:rPr>
                 <w:rFonts w:ascii="Calibri" w:eastAsia="Calibri" w:hAnsi="Calibri" w:cs="Calibri"/>
                 <w:color w:val="1F4E79" w:themeColor="accent5" w:themeShade="80"/>
-                <w:sz w:val="22"/>
-                <w:szCs w:val="22"/>
-              </w:rPr>
-            </w:pPr>
-            <w:r>
-              <w:rPr>
-                <w:rFonts w:ascii="Calibri" w:eastAsia="Calibri" w:hAnsi="Calibri" w:cs="Calibri"/>
+                <w:sz w:val="28"/>
+                <w:szCs w:val="28"/>
+              </w:rPr>
+            </w:pPr>
+            <w:r>
+              <w:rPr>
+                <w:rFonts w:ascii="Calibri" w:eastAsia="Calibri" w:hAnsi="Calibri" w:cs="Calibri"/>
+                <w:b/>
+                <w:bCs/>
                 <w:color w:val="1F4E79" w:themeColor="accent5" w:themeShade="80"/>
-                <w:sz w:val="22"/>
-                <w:szCs w:val="22"/>
-              </w:rPr>
-              <w:t>Descripción Metodología</w:t>
+                <w:sz w:val="28"/>
+                <w:szCs w:val="28"/>
+              </w:rPr>
+              <w:t>Especificaciones técnicas de la solución a desarrollar</w:t>
             </w:r>
           </w:p>
         </w:tc>
@@ -3762,241 +3992,59 @@
           </w:tcPr>
           <w:p>
             <w:r>
-              <w:t>Metodología ágil Scrum adaptada al contexto académico, con sprints semanales alineados a los hitos de entrega. Ciclo de vida iterativo-incremental. Roles: Product Owner (docente), Scrum Master (coordinador del equipo), Development Team (3 integrantes). Ceremonias: reunión de planificación al inicio de cada sprint, revisión semanal de avances. Herramientas: GitHub Projects (Kanban), Pull Requests con revisión cruzada.</w:t>
-            </w:r>
-          </w:p>
-        </w:tc>
-      </w:tr>
-    </w:tbl>
-    <w:p>
-      <w:pPr>
-        <w:spacing w:after="160" w:line="360" w:lineRule="auto"/>
-        <w:jc w:val="both"/>
-        <w:rPr>
-          <w:rFonts w:ascii="Calibri" w:eastAsia="Calibri" w:hAnsi="Calibri" w:cs="Calibri"/>
-          <w:color w:val="000000" w:themeColor="text1"/>
-          <w:lang w:val="es-ES"/>
-        </w:rPr>
-      </w:pPr>
-    </w:p>
-    <w:tbl>
-      <w:tblPr>
-        <w:tblStyle w:val="TableGrid"/>
-        <w:tblW w:w="0" w:type="auto"/>
-        <w:tblBorders>
-          <w:top w:val="single" w:sz="6" w:space="0" w:color="auto"/>
-          <w:left w:val="single" w:sz="6" w:space="0" w:color="auto"/>
-          <w:bottom w:val="single" w:sz="6" w:space="0" w:color="auto"/>
-          <w:right w:val="single" w:sz="6" w:space="0" w:color="auto"/>
-        </w:tblBorders>
-        <w:tblLayout w:type="fixed"/>
-        <w:tblLook w:val="04A0" w:firstRow="1" w:lastRow="0" w:firstColumn="1" w:lastColumn="0" w:noHBand="0" w:noVBand="1"/>
-      </w:tblPr>
-      <w:tblGrid>
-        <w:gridCol w:w="8835"/>
-      </w:tblGrid>
-      <w:tr>
-        <w:trPr>
-          <w:trHeight w:val="435"/>
-        </w:trPr>
-        <w:tc>
-          <w:tcPr>
-            <w:tcW w:w="8835" w:type="dxa"/>
-            <w:tcBorders>
-              <w:top w:val="single" w:sz="6" w:space="0" w:color="BFBFBF" w:themeColor="background1" w:themeShade="BF"/>
-              <w:left w:val="single" w:sz="6" w:space="0" w:color="BFBFBF" w:themeColor="background1" w:themeShade="BF"/>
-              <w:bottom w:val="single" w:sz="6" w:space="0" w:color="BFBFBF" w:themeColor="background1" w:themeShade="BF"/>
-              <w:right w:val="single" w:sz="6" w:space="0" w:color="BFBFBF" w:themeColor="background1" w:themeShade="BF"/>
-            </w:tcBorders>
-            <w:tcMar>
-              <w:left w:w="105" w:type="dxa"/>
-              <w:right w:w="105" w:type="dxa"/>
-            </w:tcMar>
-            <w:vAlign w:val="center"/>
-          </w:tcPr>
-          <w:p>
-            <w:pPr>
-              <w:spacing w:line="259" w:lineRule="auto"/>
-              <w:rPr>
-                <w:rFonts w:ascii="Calibri" w:eastAsia="Calibri" w:hAnsi="Calibri" w:cs="Calibri"/>
-                <w:color w:val="1F4E79" w:themeColor="accent5" w:themeShade="80"/>
-                <w:sz w:val="28"/>
-                <w:szCs w:val="28"/>
-              </w:rPr>
-            </w:pPr>
-            <w:r>
-              <w:rPr>
-                <w:rFonts w:ascii="Calibri" w:eastAsia="Calibri" w:hAnsi="Calibri" w:cs="Calibri"/>
-                <w:b/>
-                <w:bCs/>
-                <w:color w:val="1F4E79" w:themeColor="accent5" w:themeShade="80"/>
-                <w:sz w:val="28"/>
-                <w:szCs w:val="28"/>
-              </w:rPr>
-              <w:t>5. Descripción técnica de la solución</w:t>
-            </w:r>
-          </w:p>
-        </w:tc>
-      </w:tr>
-      <w:tr>
-        <w:trPr>
-          <w:trHeight w:val="435"/>
-        </w:trPr>
-        <w:tc>
-          <w:tcPr>
-            <w:tcW w:w="8835" w:type="dxa"/>
-            <w:tcBorders>
-              <w:top w:val="single" w:sz="6" w:space="0" w:color="BFBFBF" w:themeColor="background1" w:themeShade="BF"/>
-              <w:left w:val="single" w:sz="6" w:space="0" w:color="BFBFBF" w:themeColor="background1" w:themeShade="BF"/>
-              <w:bottom w:val="single" w:sz="6" w:space="0" w:color="BFBFBF" w:themeColor="background1" w:themeShade="BF"/>
-              <w:right w:val="single" w:sz="6" w:space="0" w:color="BFBFBF" w:themeColor="background1" w:themeShade="BF"/>
-            </w:tcBorders>
-            <w:shd w:val="clear" w:color="auto" w:fill="DEEAF6" w:themeFill="accent5" w:themeFillTint="33"/>
-            <w:tcMar>
-              <w:left w:w="105" w:type="dxa"/>
-              <w:right w:w="105" w:type="dxa"/>
-            </w:tcMar>
-            <w:vAlign w:val="center"/>
-          </w:tcPr>
-          <w:p>
-            <w:pPr>
-              <w:pStyle w:val="Footer"/>
-              <w:jc w:val="both"/>
-              <w:rPr>
-                <w:rFonts w:ascii="Calibri" w:eastAsia="Calibri" w:hAnsi="Calibri" w:cs="Calibri"/>
-                <w:color w:val="1F4E79" w:themeColor="accent5" w:themeShade="80"/>
-                <w:sz w:val="22"/>
-                <w:szCs w:val="22"/>
-              </w:rPr>
-            </w:pPr>
-            <w:r>
-              <w:rPr>
-                <w:rFonts w:ascii="Calibri" w:eastAsia="Calibri" w:hAnsi="Calibri" w:cs="Calibri"/>
-                <w:color w:val="1F4E79" w:themeColor="accent5" w:themeShade="80"/>
-                <w:sz w:val="22"/>
-                <w:szCs w:val="22"/>
-              </w:rPr>
-              <w:t>Describir los detalles técnicos del producto a desarrollar</w:t>
-            </w:r>
-          </w:p>
-        </w:tc>
-      </w:tr>
-    </w:tbl>
-    <w:p>
-      <w:pPr>
-        <w:spacing w:line="360" w:lineRule="auto"/>
-        <w:jc w:val="both"/>
-        <w:rPr>
-          <w:rFonts w:ascii="Calibri" w:eastAsia="Calibri" w:hAnsi="Calibri" w:cs="Calibri"/>
-          <w:color w:val="000000" w:themeColor="text1"/>
-          <w:lang w:val="es-ES"/>
-        </w:rPr>
-      </w:pPr>
-    </w:p>
-    <w:tbl>
-      <w:tblPr>
-        <w:tblStyle w:val="TableGrid"/>
-        <w:tblW w:w="0" w:type="auto"/>
-        <w:tblBorders>
-          <w:top w:val="single" w:sz="6" w:space="0" w:color="auto"/>
-          <w:left w:val="single" w:sz="6" w:space="0" w:color="auto"/>
-          <w:bottom w:val="single" w:sz="6" w:space="0" w:color="auto"/>
-          <w:right w:val="single" w:sz="6" w:space="0" w:color="auto"/>
-        </w:tblBorders>
-        <w:tblLayout w:type="fixed"/>
-        <w:tblLook w:val="04A0" w:firstRow="1" w:lastRow="0" w:firstColumn="1" w:lastColumn="0" w:noHBand="0" w:noVBand="1"/>
-      </w:tblPr>
-      <w:tblGrid>
-        <w:gridCol w:w="8835"/>
-      </w:tblGrid>
-      <w:tr>
-        <w:trPr>
-          <w:trHeight w:val="300"/>
-        </w:trPr>
-        <w:tc>
-          <w:tcPr>
-            <w:tcW w:w="8835" w:type="dxa"/>
-            <w:tcBorders>
-              <w:top w:val="single" w:sz="6" w:space="0" w:color="BFBFBF" w:themeColor="background1" w:themeShade="BF"/>
-              <w:left w:val="single" w:sz="6" w:space="0" w:color="BFBFBF" w:themeColor="background1" w:themeShade="BF"/>
-              <w:bottom w:val="single" w:sz="6" w:space="0" w:color="BFBFBF" w:themeColor="background1" w:themeShade="BF"/>
-              <w:right w:val="single" w:sz="6" w:space="0" w:color="BFBFBF" w:themeColor="background1" w:themeShade="BF"/>
-            </w:tcBorders>
-            <w:tcMar>
-              <w:left w:w="105" w:type="dxa"/>
-              <w:right w:w="105" w:type="dxa"/>
-            </w:tcMar>
-          </w:tcPr>
-          <w:p>
-            <w:pPr>
-              <w:spacing w:line="259" w:lineRule="auto"/>
-              <w:jc w:val="center"/>
-              <w:rPr>
-                <w:rFonts w:ascii="Calibri" w:eastAsia="Calibri" w:hAnsi="Calibri" w:cs="Calibri"/>
-                <w:color w:val="1F4E79" w:themeColor="accent5" w:themeShade="80"/>
-                <w:sz w:val="28"/>
-                <w:szCs w:val="28"/>
-              </w:rPr>
-            </w:pPr>
-            <w:r>
-              <w:rPr>
-                <w:rFonts w:ascii="Calibri" w:eastAsia="Calibri" w:hAnsi="Calibri" w:cs="Calibri"/>
-                <w:b/>
-                <w:bCs/>
-                <w:color w:val="1F4E79" w:themeColor="accent5" w:themeShade="80"/>
-                <w:sz w:val="28"/>
-                <w:szCs w:val="28"/>
-              </w:rPr>
-              <w:t>Especificaciones técnicas de la solución a desarrollar</w:t>
-            </w:r>
-          </w:p>
-        </w:tc>
-      </w:tr>
-      <w:tr>
-        <w:trPr>
-          <w:trHeight w:val="1920"/>
-        </w:trPr>
-        <w:tc>
-          <w:tcPr>
-            <w:tcW w:w="8835" w:type="dxa"/>
-            <w:tcBorders>
-              <w:top w:val="single" w:sz="6" w:space="0" w:color="BFBFBF" w:themeColor="background1" w:themeShade="BF"/>
-              <w:left w:val="single" w:sz="6" w:space="0" w:color="BFBFBF" w:themeColor="background1" w:themeShade="BF"/>
-              <w:bottom w:val="single" w:sz="6" w:space="0" w:color="BFBFBF" w:themeColor="background1" w:themeShade="BF"/>
-              <w:right w:val="single" w:sz="6" w:space="0" w:color="BFBFBF" w:themeColor="background1" w:themeShade="BF"/>
-            </w:tcBorders>
-            <w:tcMar>
-              <w:left w:w="105" w:type="dxa"/>
-              <w:right w:w="105" w:type="dxa"/>
-            </w:tcMar>
-          </w:tcPr>
-          <w:p>
-            <w:r>
               <w:t>Infraestructura:</w:t>
+            </w:r>
+            <w:r>
               <w:br/>
               <w:t>- Frontend: React 19 + Vite, desplegado en Vercel</w:t>
+            </w:r>
+            <w:r>
               <w:br/>
               <w:t>- Backend: Node.js + Express + TypeScript, desplegado en Render (Docker)</w:t>
+            </w:r>
+            <w:r>
               <w:br/>
               <w:t>- Base de datos: PostgreSQL en Supabase</w:t>
+            </w:r>
+            <w:r>
               <w:br/>
               <w:t>- Imágenes: Cloudinary (almacenamiento y CDN)</w:t>
+            </w:r>
+            <w:r>
               <w:br/>
               <w:t>- Control de versiones: GitHub con ramas y Pull Requests</w:t>
+            </w:r>
+            <w:r>
               <w:br/>
+            </w:r>
+            <w:r>
               <w:br/>
               <w:t>Arquitectura:</w:t>
+            </w:r>
+            <w:r>
               <w:br/>
               <w:t>- Backend: MVC (Modelo-Vista-Controlador) con Express</w:t>
+            </w:r>
+            <w:r>
               <w:br/>
               <w:t>- Frontend: Componentes React con patrón Contenedor/Presentación</w:t>
+            </w:r>
+            <w:r>
               <w:br/>
               <w:t>- API REST con autenticación JWT y control de roles (admin, employee, customer)</w:t>
+            </w:r>
+            <w:r>
               <w:br/>
               <w:t>- Seguridad: Helmet, CORS, rate-limiting, Zod validation, bcrypt</w:t>
+            </w:r>
+            <w:r>
               <w:br/>
               <w:t>- Docker multi-stage para despliegue en Render</w:t>
+            </w:r>
+            <w:r>
               <w:br/>
+            </w:r>
+            <w:r>
               <w:br/>
               <w:t>Base de datos relacional PostgreSQL con 10 tablas: products, product_images, clients, damage_types, rentals, returns, sales, dispatches, corporate_info, users. Row Level Security habilitado.</w:t>
             </w:r>
@@ -4685,8 +4733,30 @@
             </w:tcMar>
           </w:tcPr>
           <w:p>
-            <w:r>
-              <w:t>Node.js, Express, TypeScript, Supabase, Figma, Draw.io</w:t>
+            <w:pPr>
+              <w:rPr>
+                <w:lang w:val="en-US"/>
+              </w:rPr>
+            </w:pPr>
+            <w:r>
+              <w:rPr>
+                <w:lang w:val="en-US"/>
+              </w:rPr>
+              <w:t xml:space="preserve">Node.js, Express, TypeScript, </w:t>
+            </w:r>
+            <w:proofErr w:type="spellStart"/>
+            <w:r>
+              <w:rPr>
+                <w:lang w:val="en-US"/>
+              </w:rPr>
+              <w:t>Supabase</w:t>
+            </w:r>
+            <w:proofErr w:type="spellEnd"/>
+            <w:r>
+              <w:rPr>
+                <w:lang w:val="en-US"/>
+              </w:rPr>
+              <w:t>, Figma, Draw.io</w:t>
             </w:r>
           </w:p>
         </w:tc>
@@ -5346,11 +5416,7 @@
               <w:right w:w="105" w:type="dxa"/>
             </w:tcMar>
           </w:tcPr>
-          <w:p>
-            <w:r>
-              <w:t>https://github.com/gabrielhermosilla/vestitus-backend</w:t>
-            </w:r>
-          </w:p>
+          <w:p/>
         </w:tc>
       </w:tr>
       <w:tr>
@@ -5431,11 +5497,7 @@
               <w:right w:w="105" w:type="dxa"/>
             </w:tcMar>
           </w:tcPr>
-          <w:p>
-            <w:r>
-              <w:t>https://github.com/gabrielhermosilla/vestitus-backend/blob/main/Producto/Script/vestitus-schema.sql</w:t>
-            </w:r>
-          </w:p>
+          <w:p/>
         </w:tc>
       </w:tr>
       <w:tr>
@@ -11369,16 +11431,6 @@
 </file>
 
 <file path=customXml/item2.xml><?xml version="1.0" encoding="utf-8"?>
-<b:Sources xmlns:b="http://schemas.openxmlformats.org/officeDocument/2006/bibliography" xmlns="http://schemas.openxmlformats.org/officeDocument/2006/bibliography" SelectedStyle="/APASixthEditionOfficeOnline.xsl" StyleName="APA" Version="6"/>
-</file>
-
-<file path=customXml/item3.xml><?xml version="1.0" encoding="utf-8"?>
-<p:properties xmlns:p="http://schemas.microsoft.com/office/2006/metadata/properties" xmlns:xsi="http://www.w3.org/2001/XMLSchema-instance" xmlns:pc="http://schemas.microsoft.com/office/infopath/2007/PartnerControls">
-  <documentManagement/>
-</p:properties>
-</file>
-
-<file path=customXml/item4.xml><?xml version="1.0" encoding="utf-8"?>
 <ct:contentTypeSchema xmlns:ct="http://schemas.microsoft.com/office/2006/metadata/contentType" xmlns:ma="http://schemas.microsoft.com/office/2006/metadata/properties/metaAttributes" ct:_="" ma:_="" ma:contentTypeName="Documento" ma:contentTypeID="0x010100AF28BDBD65D93F4BA99B6439AFEA320E" ma:contentTypeVersion="10" ma:contentTypeDescription="Crear nuevo documento." ma:contentTypeScope="" ma:versionID="11d45d99e0339591c68aad091688ac92">
   <xsd:schema xmlns:xsd="http://www.w3.org/2001/XMLSchema" xmlns:xs="http://www.w3.org/2001/XMLSchema" xmlns:p="http://schemas.microsoft.com/office/2006/metadata/properties" xmlns:ns2="9b0ef35d-78e7-41bf-847f-3c0497ad5352" xmlns:ns3="3c969135-7855-44e0-a9fe-01d799f07605" targetNamespace="http://schemas.microsoft.com/office/2006/metadata/properties" ma:root="true" ma:fieldsID="0e603a3f7bf67670d682b80385fe4b00" ns2:_="" ns3:_="">
     <xsd:import namespace="9b0ef35d-78e7-41bf-847f-3c0497ad5352"/>
@@ -11579,6 +11631,16 @@
 </ct:contentTypeSchema>
 </file>
 
+<file path=customXml/item3.xml><?xml version="1.0" encoding="utf-8"?>
+<p:properties xmlns:p="http://schemas.microsoft.com/office/2006/metadata/properties" xmlns:xsi="http://www.w3.org/2001/XMLSchema-instance" xmlns:pc="http://schemas.microsoft.com/office/infopath/2007/PartnerControls">
+  <documentManagement/>
+</p:properties>
+</file>
+
+<file path=customXml/item4.xml><?xml version="1.0" encoding="utf-8"?>
+<b:Sources xmlns:b="http://schemas.openxmlformats.org/officeDocument/2006/bibliography" xmlns="http://schemas.openxmlformats.org/officeDocument/2006/bibliography" SelectedStyle="/APASixthEditionOfficeOnline.xsl" StyleName="APA" Version="6"/>
+</file>
+
 <file path=customXml/itemProps1.xml><?xml version="1.0" encoding="utf-8"?>
 <ds:datastoreItem xmlns:ds="http://schemas.openxmlformats.org/officeDocument/2006/customXml" ds:itemID="{836CD6ED-D121-451D-9009-89041862BDCC}">
   <ds:schemaRefs>
@@ -11588,23 +11650,6 @@
 </file>
 
 <file path=customXml/itemProps2.xml><?xml version="1.0" encoding="utf-8"?>
-<ds:datastoreItem xmlns:ds="http://schemas.openxmlformats.org/officeDocument/2006/customXml" ds:itemID="{7BCEAE7D-0658-4599-9467-160E0680ABF1}">
-  <ds:schemaRefs>
-    <ds:schemaRef ds:uri="http://schemas.openxmlformats.org/officeDocument/2006/bibliography"/>
-  </ds:schemaRefs>
-</ds:datastoreItem>
-</file>
-
-<file path=customXml/itemProps3.xml><?xml version="1.0" encoding="utf-8"?>
-<ds:datastoreItem xmlns:ds="http://schemas.openxmlformats.org/officeDocument/2006/customXml" ds:itemID="{1F0F8696-2F11-4ED2-B3BB-20313B5F1328}">
-  <ds:schemaRefs>
-    <ds:schemaRef ds:uri="http://schemas.microsoft.com/office/2006/metadata/properties"/>
-    <ds:schemaRef ds:uri="http://schemas.microsoft.com/office/infopath/2007/PartnerControls"/>
-  </ds:schemaRefs>
-</ds:datastoreItem>
-</file>
-
-<file path=customXml/itemProps4.xml><?xml version="1.0" encoding="utf-8"?>
 <ds:datastoreItem xmlns:ds="http://schemas.openxmlformats.org/officeDocument/2006/customXml" ds:itemID="{45AF2103-6344-4B3B-BBB6-7B451BD9DA8A}">
   <ds:schemaRefs>
     <ds:schemaRef ds:uri="http://schemas.microsoft.com/office/2006/metadata/contentType"/>
@@ -11621,4 +11666,21 @@
     <ds:schemaRef ds:uri="http://schemas.microsoft.com/internal/obd"/>
   </ds:schemaRefs>
 </ds:datastoreItem>
+</file>
+
+<file path=customXml/itemProps3.xml><?xml version="1.0" encoding="utf-8"?>
+<ds:datastoreItem xmlns:ds="http://schemas.openxmlformats.org/officeDocument/2006/customXml" ds:itemID="{1F0F8696-2F11-4ED2-B3BB-20313B5F1328}">
+  <ds:schemaRefs>
+    <ds:schemaRef ds:uri="http://schemas.microsoft.com/office/2006/metadata/properties"/>
+    <ds:schemaRef ds:uri="http://schemas.microsoft.com/office/infopath/2007/PartnerControls"/>
+  </ds:schemaRefs>
+</ds:datastoreItem>
+</file>
+
+<file path=customXml/itemProps4.xml><?xml version="1.0" encoding="utf-8"?>
+<ds:datastoreItem xmlns:ds="http://schemas.openxmlformats.org/officeDocument/2006/customXml" ds:itemID="{7BCEAE7D-0658-4599-9467-160E0680ABF1}">
+  <ds:schemaRefs>
+    <ds:schemaRef ds:uri="http://schemas.openxmlformats.org/officeDocument/2006/bibliography"/>
+  </ds:schemaRefs>
+</ds:datastoreItem>
 </file>
</xml_diff>